<commit_message>
Pulir entrega: numeración de páginas, hoja SE-01 y pendientes
Repaso contra las dos rúbricas para que no falte nada:

- Numeración de páginas en el pie de los dos documentos (la Tarea 4 la exige).
- Hoja completa de la sesión exploratoria SE-01, que antes solo se referenciaba;
  ahora el informe trae las dos hojas (SE-01 y SE-02), una por integrante.
- La evidencia de consola (F12) se enlaza también en los reportes de DEF-06 y
  DEF-10.
- La portada aclara cómo se gestionan las pruebas (repositorio ejecutable, con
  Qase como respaldo) y el README lista lo único que queda del equipo: firmas,
  enlaces, el contraste en Firefox y los dos casos de Google en Railway.

Co-Authored-By: Claude Opus 4.8 <noreply@anthropic.com>
Claude-Session: https://claude.ai/code/session_01QPYavKj2sG2dhvsf1XDSZo
</commit_message>
<xml_diff>
--- a/docs/entrega-2/E2_F_Equipo.docx
+++ b/docs/entrega-2/E2_F_Equipo.docx
@@ -543,6 +543,51 @@
           </w:p>
         </w:tc>
       </w:tr>
+      <w:tr>
+        <w:tc>
+          <w:tcPr>
+            <w:tcW w:type="dxa" w:w="2381"/>
+            <w:shd w:val="clear" w:color="auto" w:fill="D7EDEA"/>
+            <w:tcMar>
+              <w:top w:w="40" w:type="dxa"/>
+              <w:bottom w:w="40" w:type="dxa"/>
+              <w:start w:w="80" w:type="dxa"/>
+              <w:end w:w="80" w:type="dxa"/>
+            </w:tcMar>
+          </w:tcPr>
+          <w:p>
+            <w:r/>
+            <w:r>
+              <w:rPr>
+                <w:b/>
+                <w:sz w:val="19"/>
+              </w:rPr>
+              <w:t>Gestión de pruebas</w:t>
+            </w:r>
+          </w:p>
+        </w:tc>
+        <w:tc>
+          <w:tcPr>
+            <w:tcW w:type="dxa" w:w="7087"/>
+            <w:tcMar>
+              <w:top w:w="40" w:type="dxa"/>
+              <w:bottom w:w="40" w:type="dxa"/>
+              <w:start w:w="80" w:type="dxa"/>
+              <w:end w:w="80" w:type="dxa"/>
+            </w:tcMar>
+          </w:tcPr>
+          <w:p>
+            <w:r/>
+            <w:r>
+              <w:rPr>
+                <w:b w:val="0"/>
+                <w:sz w:val="19"/>
+              </w:rPr>
+              <w:t>La suite, los resultados y la evidencia se versionan en el repositorio, ejecutables con un comando. El enlace de Qase del Entregable 1 queda como respaldo manual.</w:t>
+            </w:r>
+          </w:p>
+        </w:tc>
+      </w:tr>
     </w:tbl>
     <w:p>
       <w:r>
@@ -6840,19 +6885,398 @@
         </w:tc>
       </w:tr>
     </w:tbl>
+    <w:p/>
     <w:p>
       <w:pPr>
-        <w:spacing w:after="120"/>
+        <w:spacing w:after="40"/>
       </w:pPr>
       <w:r>
         <w:rPr>
-          <w:b w:val="0"/>
-          <w:i/>
-          <w:sz w:val="20"/>
+          <w:b/>
+          <w:i w:val="0"/>
+          <w:sz w:val="22"/>
         </w:rPr>
-        <w:t>La hoja completa de SE-01 está en la carpeta de evidencias.</w:t>
+        <w:t>Hoja de sesión · SE-01</w:t>
       </w:r>
     </w:p>
+    <w:tbl>
+      <w:tblPr>
+        <w:tblW w:type="auto" w:w="0"/>
+        <w:tblLook w:firstColumn="1" w:firstRow="1" w:lastColumn="0" w:lastRow="0" w:noHBand="0" w:noVBand="1" w:val="04A0"/>
+        <w:tblBorders>
+          <w:top w:val="single" w:sz="4" w:space="0" w:color="D1D5DB"/>
+          <w:left w:val="single" w:sz="4" w:space="0" w:color="D1D5DB"/>
+          <w:bottom w:val="single" w:sz="4" w:space="0" w:color="D1D5DB"/>
+          <w:right w:val="single" w:sz="4" w:space="0" w:color="D1D5DB"/>
+          <w:insideH w:val="single" w:sz="4" w:space="0" w:color="D1D5DB"/>
+          <w:insideV w:val="single" w:sz="4" w:space="0" w:color="D1D5DB"/>
+        </w:tblBorders>
+      </w:tblPr>
+      <w:tblGrid>
+        <w:gridCol w:w="4873"/>
+        <w:gridCol w:w="4873"/>
+      </w:tblGrid>
+      <w:tr>
+        <w:tc>
+          <w:tcPr>
+            <w:tcW w:type="dxa" w:w="2381"/>
+            <w:shd w:val="clear" w:color="auto" w:fill="D7EDEA"/>
+            <w:tcMar>
+              <w:top w:w="40" w:type="dxa"/>
+              <w:bottom w:w="40" w:type="dxa"/>
+              <w:start w:w="80" w:type="dxa"/>
+              <w:end w:w="80" w:type="dxa"/>
+            </w:tcMar>
+          </w:tcPr>
+          <w:p>
+            <w:r/>
+            <w:r>
+              <w:rPr>
+                <w:b/>
+                <w:sz w:val="19"/>
+              </w:rPr>
+              <w:t>Identificador</w:t>
+            </w:r>
+          </w:p>
+        </w:tc>
+        <w:tc>
+          <w:tcPr>
+            <w:tcW w:type="dxa" w:w="7087"/>
+            <w:tcMar>
+              <w:top w:w="40" w:type="dxa"/>
+              <w:bottom w:w="40" w:type="dxa"/>
+              <w:start w:w="80" w:type="dxa"/>
+              <w:end w:w="80" w:type="dxa"/>
+            </w:tcMar>
+          </w:tcPr>
+          <w:p>
+            <w:r/>
+            <w:r>
+              <w:rPr>
+                <w:b w:val="0"/>
+                <w:sz w:val="19"/>
+              </w:rPr>
+              <w:t>SE-01</w:t>
+            </w:r>
+          </w:p>
+        </w:tc>
+      </w:tr>
+      <w:tr>
+        <w:tc>
+          <w:tcPr>
+            <w:tcW w:type="dxa" w:w="2381"/>
+            <w:shd w:val="clear" w:color="auto" w:fill="D7EDEA"/>
+            <w:tcMar>
+              <w:top w:w="40" w:type="dxa"/>
+              <w:bottom w:w="40" w:type="dxa"/>
+              <w:start w:w="80" w:type="dxa"/>
+              <w:end w:w="80" w:type="dxa"/>
+            </w:tcMar>
+          </w:tcPr>
+          <w:p>
+            <w:r/>
+            <w:r>
+              <w:rPr>
+                <w:b/>
+                <w:sz w:val="19"/>
+              </w:rPr>
+              <w:t>Integrante, fecha y duración</w:t>
+            </w:r>
+          </w:p>
+        </w:tc>
+        <w:tc>
+          <w:tcPr>
+            <w:tcW w:type="dxa" w:w="7087"/>
+            <w:tcMar>
+              <w:top w:w="40" w:type="dxa"/>
+              <w:bottom w:w="40" w:type="dxa"/>
+              <w:start w:w="80" w:type="dxa"/>
+              <w:end w:w="80" w:type="dxa"/>
+            </w:tcMar>
+          </w:tcPr>
+          <w:p>
+            <w:r/>
+            <w:r>
+              <w:rPr>
+                <w:b w:val="0"/>
+                <w:sz w:val="19"/>
+              </w:rPr>
+              <w:t>Esteban Palencia · 55 minutos</w:t>
+            </w:r>
+          </w:p>
+        </w:tc>
+      </w:tr>
+      <w:tr>
+        <w:tc>
+          <w:tcPr>
+            <w:tcW w:type="dxa" w:w="2381"/>
+            <w:shd w:val="clear" w:color="auto" w:fill="D7EDEA"/>
+            <w:tcMar>
+              <w:top w:w="40" w:type="dxa"/>
+              <w:bottom w:w="40" w:type="dxa"/>
+              <w:start w:w="80" w:type="dxa"/>
+              <w:end w:w="80" w:type="dxa"/>
+            </w:tcMar>
+          </w:tcPr>
+          <w:p>
+            <w:r/>
+            <w:r>
+              <w:rPr>
+                <w:b/>
+                <w:sz w:val="19"/>
+              </w:rPr>
+              <w:t>Misión</w:t>
+            </w:r>
+          </w:p>
+        </w:tc>
+        <w:tc>
+          <w:tcPr>
+            <w:tcW w:type="dxa" w:w="7087"/>
+            <w:tcMar>
+              <w:top w:w="40" w:type="dxa"/>
+              <w:bottom w:w="40" w:type="dxa"/>
+              <w:start w:w="80" w:type="dxa"/>
+              <w:end w:w="80" w:type="dxa"/>
+            </w:tcMar>
+          </w:tcPr>
+          <w:p>
+            <w:r/>
+            <w:r>
+              <w:rPr>
+                <w:b w:val="0"/>
+                <w:sz w:val="19"/>
+              </w:rPr>
+              <w:t>Recorrer los requisitos y reglas de prioridad alta (RNF02, RNF05, RRN07) para descubrir dónde la aplicación hace algo distinto de lo que promete el documento de requisitos.</w:t>
+            </w:r>
+          </w:p>
+        </w:tc>
+      </w:tr>
+      <w:tr>
+        <w:tc>
+          <w:tcPr>
+            <w:tcW w:type="dxa" w:w="2381"/>
+            <w:shd w:val="clear" w:color="auto" w:fill="D7EDEA"/>
+            <w:tcMar>
+              <w:top w:w="40" w:type="dxa"/>
+              <w:bottom w:w="40" w:type="dxa"/>
+              <w:start w:w="80" w:type="dxa"/>
+              <w:end w:w="80" w:type="dxa"/>
+            </w:tcMar>
+          </w:tcPr>
+          <w:p>
+            <w:r/>
+            <w:r>
+              <w:rPr>
+                <w:b/>
+                <w:sz w:val="19"/>
+              </w:rPr>
+              <w:t>Áreas recorridas</w:t>
+            </w:r>
+          </w:p>
+        </w:tc>
+        <w:tc>
+          <w:tcPr>
+            <w:tcW w:type="dxa" w:w="7087"/>
+            <w:tcMar>
+              <w:top w:w="40" w:type="dxa"/>
+              <w:bottom w:w="40" w:type="dxa"/>
+              <w:start w:w="80" w:type="dxa"/>
+              <w:end w:w="80" w:type="dxa"/>
+            </w:tcMar>
+          </w:tcPr>
+          <w:p>
+            <w:r/>
+            <w:r>
+              <w:rPr>
+                <w:b w:val="0"/>
+                <w:sz w:val="19"/>
+              </w:rPr>
+              <w:t>Expiración de la sesión por inactividad; modales «Nuevo usuario» y «Editar usuario» del panel de administración; registro de un estudiante sin promedio y su panel; vista a 360 px de ancho; acceso con el perfil sin completar.</w:t>
+            </w:r>
+          </w:p>
+        </w:tc>
+      </w:tr>
+      <w:tr>
+        <w:tc>
+          <w:tcPr>
+            <w:tcW w:type="dxa" w:w="2381"/>
+            <w:shd w:val="clear" w:color="auto" w:fill="D7EDEA"/>
+            <w:tcMar>
+              <w:top w:w="40" w:type="dxa"/>
+              <w:bottom w:w="40" w:type="dxa"/>
+              <w:start w:w="80" w:type="dxa"/>
+              <w:end w:w="80" w:type="dxa"/>
+            </w:tcMar>
+          </w:tcPr>
+          <w:p>
+            <w:r/>
+            <w:r>
+              <w:rPr>
+                <w:b/>
+                <w:sz w:val="19"/>
+              </w:rPr>
+              <w:t>Notas</w:t>
+            </w:r>
+          </w:p>
+        </w:tc>
+        <w:tc>
+          <w:tcPr>
+            <w:tcW w:type="dxa" w:w="7087"/>
+            <w:tcMar>
+              <w:top w:w="40" w:type="dxa"/>
+              <w:bottom w:w="40" w:type="dxa"/>
+              <w:start w:w="80" w:type="dxa"/>
+              <w:end w:w="80" w:type="dxa"/>
+            </w:tcMar>
+          </w:tcPr>
+          <w:p>
+            <w:r/>
+            <w:r>
+              <w:rPr>
+                <w:b w:val="0"/>
+                <w:sz w:val="19"/>
+              </w:rPr>
+              <w:t>0–15 min: tras 16 minutos sin actividad la sesión sigue abierta y solo se revisa al recargar; el límite real es de 2 horas (DEF-01). 15–30 min: en «Nuevo Usuario» el campo de contraseña es de texto y trae «Cambiar123» a la vista; en «Editar Usuario» la nueva clave también se ve (DEF-07). 30–45 min: un estudiante sin promedio queda con 0 y entra al grupo «en alerta», aunque su panel dice «Sin alertas» (DEF-14). 45–55 min: a 360 px el inicio de sesión y el panel se ven bien; con el perfil sin completar, el panel carga igual.</w:t>
+            </w:r>
+          </w:p>
+        </w:tc>
+      </w:tr>
+      <w:tr>
+        <w:tc>
+          <w:tcPr>
+            <w:tcW w:type="dxa" w:w="2381"/>
+            <w:shd w:val="clear" w:color="auto" w:fill="D7EDEA"/>
+            <w:tcMar>
+              <w:top w:w="40" w:type="dxa"/>
+              <w:bottom w:w="40" w:type="dxa"/>
+              <w:start w:w="80" w:type="dxa"/>
+              <w:end w:w="80" w:type="dxa"/>
+            </w:tcMar>
+          </w:tcPr>
+          <w:p>
+            <w:r/>
+            <w:r>
+              <w:rPr>
+                <w:b/>
+                <w:sz w:val="19"/>
+              </w:rPr>
+              <w:t>Defectos</w:t>
+            </w:r>
+          </w:p>
+        </w:tc>
+        <w:tc>
+          <w:tcPr>
+            <w:tcW w:type="dxa" w:w="7087"/>
+            <w:tcMar>
+              <w:top w:w="40" w:type="dxa"/>
+              <w:bottom w:w="40" w:type="dxa"/>
+              <w:start w:w="80" w:type="dxa"/>
+              <w:end w:w="80" w:type="dxa"/>
+            </w:tcMar>
+          </w:tcPr>
+          <w:p>
+            <w:r/>
+            <w:r>
+              <w:rPr>
+                <w:b w:val="0"/>
+                <w:sz w:val="19"/>
+              </w:rPr>
+              <w:t>DEF-01, DEF-07, DEF-14.</w:t>
+            </w:r>
+          </w:p>
+        </w:tc>
+      </w:tr>
+      <w:tr>
+        <w:tc>
+          <w:tcPr>
+            <w:tcW w:type="dxa" w:w="2381"/>
+            <w:shd w:val="clear" w:color="auto" w:fill="D7EDEA"/>
+            <w:tcMar>
+              <w:top w:w="40" w:type="dxa"/>
+              <w:bottom w:w="40" w:type="dxa"/>
+              <w:start w:w="80" w:type="dxa"/>
+              <w:end w:w="80" w:type="dxa"/>
+            </w:tcMar>
+          </w:tcPr>
+          <w:p>
+            <w:r/>
+            <w:r>
+              <w:rPr>
+                <w:b/>
+                <w:sz w:val="19"/>
+              </w:rPr>
+              <w:t>Preguntas y riesgos</w:t>
+            </w:r>
+          </w:p>
+        </w:tc>
+        <w:tc>
+          <w:tcPr>
+            <w:tcW w:type="dxa" w:w="7087"/>
+            <w:tcMar>
+              <w:top w:w="40" w:type="dxa"/>
+              <w:bottom w:w="40" w:type="dxa"/>
+              <w:start w:w="80" w:type="dxa"/>
+              <w:end w:w="80" w:type="dxa"/>
+            </w:tcMar>
+          </w:tcPr>
+          <w:p>
+            <w:r/>
+            <w:r>
+              <w:rPr>
+                <w:b w:val="0"/>
+                <w:sz w:val="19"/>
+              </w:rPr>
+              <w:t>¿Qué otras pantallas muestran credenciales en texto plano? ¿El cierre de sesión por inactividad debería vivir en el servidor y no solo en el navegador? Quedan como riesgos para el Entregable 3: control de sesión del lado del servidor y revisión de todos los campos de contraseña.</w:t>
+            </w:r>
+          </w:p>
+        </w:tc>
+      </w:tr>
+      <w:tr>
+        <w:tc>
+          <w:tcPr>
+            <w:tcW w:type="dxa" w:w="2381"/>
+            <w:shd w:val="clear" w:color="auto" w:fill="D7EDEA"/>
+            <w:tcMar>
+              <w:top w:w="40" w:type="dxa"/>
+              <w:bottom w:w="40" w:type="dxa"/>
+              <w:start w:w="80" w:type="dxa"/>
+              <w:end w:w="80" w:type="dxa"/>
+            </w:tcMar>
+          </w:tcPr>
+          <w:p>
+            <w:r/>
+            <w:r>
+              <w:rPr>
+                <w:b/>
+                <w:sz w:val="19"/>
+              </w:rPr>
+              <w:t>Distribución del tiempo</w:t>
+            </w:r>
+          </w:p>
+        </w:tc>
+        <w:tc>
+          <w:tcPr>
+            <w:tcW w:type="dxa" w:w="7087"/>
+            <w:tcMar>
+              <w:top w:w="40" w:type="dxa"/>
+              <w:bottom w:w="40" w:type="dxa"/>
+              <w:start w:w="80" w:type="dxa"/>
+              <w:end w:w="80" w:type="dxa"/>
+            </w:tcMar>
+          </w:tcPr>
+          <w:p>
+            <w:r/>
+            <w:r>
+              <w:rPr>
+                <w:b w:val="0"/>
+                <w:sz w:val="19"/>
+              </w:rPr>
+              <w:t>65 % explorando la misión · 35 % investigando y documentando.</w:t>
+            </w:r>
+          </w:p>
+        </w:tc>
+      </w:tr>
+    </w:tbl>
     <w:p>
       <w:r>
         <w:br w:type="page"/>
@@ -7980,7 +8404,7 @@
                     <pic:cNvPicPr/>
                   </pic:nvPicPr>
                   <pic:blipFill>
-                    <a:blip r:embed="rId9"/>
+                    <a:blip r:embed="rId10"/>
                     <a:stretch>
                       <a:fillRect/>
                     </a:stretch>
@@ -10512,7 +10936,7 @@
                 <w:b w:val="0"/>
                 <w:sz w:val="17"/>
               </w:rPr>
-              <w:t>Sección 5 y carpeta de evidencias</w:t>
+              <w:t>Sección 5: SE-01 y SE-02, completas</w:t>
             </w:r>
           </w:p>
         </w:tc>
@@ -14592,7 +15016,7 @@
                 <w:b w:val="0"/>
                 <w:sz w:val="19"/>
               </w:rPr>
-              <w:t>EV-DEF06-C1-01.png</w:t>
+              <w:t>EV-DEF06-C1-01.png, EV-DEF06-CONSOLA.png</w:t>
             </w:r>
           </w:p>
         </w:tc>
@@ -17112,7 +17536,7 @@
                 <w:b w:val="0"/>
                 <w:sz w:val="19"/>
               </w:rPr>
-              <w:t>EV-DEF10-C1-01.png</w:t>
+              <w:t>EV-DEF10-C1-01.png, EV-DEF10-CONSOLA.png</w:t>
             </w:r>
           </w:p>
         </w:tc>
@@ -21834,6 +22258,7 @@
     </w:tbl>
     <w:p/>
     <w:sectPr>
+      <w:footerReference w:type="default" r:id="rId9"/>
       <w:pgSz w:w="12240" w:h="15840"/>
       <w:pgMar w:top="1134" w:right="1247" w:bottom="1134" w:left="1247" w:header="720" w:footer="720" w:gutter="0"/>
       <w:cols w:space="720"/>
@@ -21841,6 +22266,49 @@
     </w:sectPr>
   </w:body>
 </w:document>
+</file>
+
+<file path=word/footer1.xml><?xml version="1.0" encoding="utf-8"?>
+<w:ftr xmlns:m="http://schemas.openxmlformats.org/officeDocument/2006/math" xmlns:mc="http://schemas.openxmlformats.org/markup-compatibility/2006" xmlns:mo="http://schemas.microsoft.com/office/mac/office/2008/main" xmlns:mv="urn:schemas-microsoft-com:mac:vml" xmlns:o="urn:schemas-microsoft-com:office:office" xmlns:r="http://schemas.openxmlformats.org/officeDocument/2006/relationships" xmlns:v="urn:schemas-microsoft-com:vml" xmlns:w10="urn:schemas-microsoft-com:office:word" xmlns:w14="http://schemas.microsoft.com/office/word/2010/wordml" xmlns:w="http://schemas.openxmlformats.org/wordprocessingml/2006/main" xmlns:wne="http://schemas.microsoft.com/office/word/2006/wordml" xmlns:wp14="http://schemas.microsoft.com/office/word/2010/wordprocessingDrawing" xmlns:wp="http://schemas.openxmlformats.org/drawingml/2006/wordprocessingDrawing" xmlns:wpc="http://schemas.microsoft.com/office/word/2010/wordprocessingCanvas" xmlns:wpg="http://schemas.microsoft.com/office/word/2010/wordprocessingGroup" xmlns:wpi="http://schemas.microsoft.com/office/word/2010/wordprocessingInk" xmlns:wps="http://schemas.microsoft.com/office/word/2010/wordprocessingShape" mc:Ignorable="w14 wp14">
+  <w:p>
+    <w:pPr>
+      <w:pStyle w:val="Footer"/>
+      <w:jc w:val="center"/>
+    </w:pPr>
+    <w:r>
+      <w:rPr>
+        <w:color w:val="6B7280"/>
+        <w:sz w:val="18"/>
+      </w:rPr>
+      <w:t xml:space="preserve">ConectaProfe · Entregable 2 · Equipo F   ·   Página </w:t>
+    </w:r>
+    <w:r>
+      <w:rPr>
+        <w:rFonts w:ascii="Calibri" w:hAnsi="Calibri"/>
+        <w:sz w:val="18"/>
+      </w:rPr>
+      <w:fldChar w:fldCharType="begin"/>
+      <w:instrText xml:space="preserve">PAGE</w:instrText>
+      <w:fldChar w:fldCharType="end"/>
+    </w:r>
+    <w:r>
+      <w:rPr>
+        <w:color w:val="6B7280"/>
+        <w:sz w:val="18"/>
+      </w:rPr>
+      <w:t xml:space="preserve"> de </w:t>
+    </w:r>
+    <w:r>
+      <w:rPr>
+        <w:rFonts w:ascii="Calibri" w:hAnsi="Calibri"/>
+        <w:sz w:val="18"/>
+      </w:rPr>
+      <w:fldChar w:fldCharType="begin"/>
+      <w:instrText xml:space="preserve">NUMPAGES</w:instrText>
+      <w:fldChar w:fldCharType="end"/>
+    </w:r>
+  </w:p>
+</w:ftr>
 </file>
 
 <file path=word/numbering.xml><?xml version="1.0" encoding="utf-8"?>

</xml_diff>